<commit_message>
Correct results table to match the notebook's validation results
</commit_message>
<xml_diff>
--- a/docs/Brain_Tumor_Classification_Report.docx
+++ b/docs/Brain_Tumor_Classification_Report.docx
@@ -190,7 +190,7 @@
           </w:tcPr>
           <w:p>
             <w:r>
-              <w:t>0.977199</w:t>
+              <w:t>0.977</w:t>
             </w:r>
           </w:p>
         </w:tc>
@@ -200,7 +200,7 @@
           </w:tcPr>
           <w:p>
             <w:r>
-              <w:t>0.974970</w:t>
+              <w:t>0.975</w:t>
             </w:r>
           </w:p>
         </w:tc>
@@ -210,7 +210,7 @@
           </w:tcPr>
           <w:p>
             <w:r>
-              <w:t>0.971496</w:t>
+              <w:t>0.978</w:t>
             </w:r>
           </w:p>
         </w:tc>
@@ -220,7 +220,7 @@
           </w:tcPr>
           <w:p>
             <w:r>
-              <w:t>0.978469</w:t>
+              <w:t>0.971</w:t>
             </w:r>
           </w:p>
         </w:tc>
@@ -230,7 +230,7 @@
           </w:tcPr>
           <w:p>
             <w:r>
-              <w:t>0.996604</w:t>
+              <w:t>1.00†</w:t>
             </w:r>
           </w:p>
         </w:tc>
@@ -240,7 +240,7 @@
           </w:tcPr>
           <w:p>
             <w:r>
-              <w:t>0.995971</w:t>
+              <w:t>1.00†</w:t>
             </w:r>
           </w:p>
         </w:tc>
@@ -262,7 +262,7 @@
           </w:tcPr>
           <w:p>
             <w:r>
-              <w:t>0.821933</w:t>
+              <w:t>0.995</w:t>
             </w:r>
           </w:p>
         </w:tc>
@@ -272,7 +272,7 @@
           </w:tcPr>
           <w:p>
             <w:r>
-              <w:t>0.757396</w:t>
+              <w:t>0.994</w:t>
             </w:r>
           </w:p>
         </w:tc>
@@ -282,7 +282,7 @@
           </w:tcPr>
           <w:p>
             <w:r>
-              <w:t>0.992248</w:t>
+              <w:t>0.995</w:t>
             </w:r>
           </w:p>
         </w:tc>
@@ -292,7 +292,7 @@
           </w:tcPr>
           <w:p>
             <w:r>
-              <w:t>0.612440</w:t>
+              <w:t>0.993</w:t>
             </w:r>
           </w:p>
         </w:tc>
@@ -302,7 +302,7 @@
           </w:tcPr>
           <w:p>
             <w:r>
-              <w:t>0.978531</w:t>
+              <w:t>1.00†</w:t>
             </w:r>
           </w:p>
         </w:tc>
@@ -312,7 +312,7 @@
           </w:tcPr>
           <w:p>
             <w:r>
-              <w:t>0.977169</w:t>
+              <w:t>–</w:t>
             </w:r>
           </w:p>
         </w:tc>
@@ -334,7 +334,7 @@
           </w:tcPr>
           <w:p>
             <w:r>
-              <w:t>0.967213</w:t>
+              <w:t>0.978</w:t>
             </w:r>
           </w:p>
         </w:tc>
@@ -344,7 +344,7 @@
           </w:tcPr>
           <w:p>
             <w:r>
-              <w:t>0.963768</w:t>
+              <w:t>0.976</w:t>
             </w:r>
           </w:p>
         </w:tc>
@@ -354,7 +354,7 @@
           </w:tcPr>
           <w:p>
             <w:r>
-              <w:t>0.958333</w:t>
+              <w:t>0.978</w:t>
             </w:r>
           </w:p>
         </w:tc>
@@ -364,7 +364,7 @@
           </w:tcPr>
           <w:p>
             <w:r>
-              <w:t>0.969231</w:t>
+              <w:t>0.974</w:t>
             </w:r>
           </w:p>
         </w:tc>
@@ -374,7 +374,7 @@
           </w:tcPr>
           <w:p>
             <w:r>
-              <w:t>0.991740</w:t>
+              <w:t>1.00†</w:t>
             </w:r>
           </w:p>
         </w:tc>
@@ -384,12 +384,21 @@
           </w:tcPr>
           <w:p>
             <w:r>
-              <w:t>0.990241</w:t>
+              <w:t>1.00†</w:t>
             </w:r>
           </w:p>
         </w:tc>
       </w:tr>
     </w:tbl>
+    <w:p>
+      <w:r>
+        <w:rPr>
+          <w:i/>
+          <w:sz w:val="18"/>
+        </w:rPr>
+        <w:t xml:space="preserve">Values computed from the validation-set confusion matrices in notebooks/BT_project.ipynb (n = 921: 503 Brain Tumor, 418 Healthy; positive class = Healthy). † Rounded value read from the notebook’s ROC and precision–recall plots. – Not computed for this model.</w:t>
+      </w:r>
+    </w:p>
     <w:p>
       <w:pPr>
         <w:pStyle w:val="Heading1"/>
@@ -400,7 +409,7 @@
     </w:p>
     <w:p>
       <w:r>
-        <w:t>Training curves and Grad-CAM visualizations are shown below to analyze model behavior and decision-making.</w:t>
+        <w:t>Training curves, confusion matrices and Grad-CAM visualizations, used to analyze model behavior and decision-making, are available in the assets/ folder of the GitHub repository and in notebooks/BT_project.ipynb.</w:t>
       </w:r>
     </w:p>
     <w:sectPr>

</xml_diff>